<commit_message>
doc update for the Agilex-3 & Agilex-5 clone
Signed-off-by: Nagavarapu Sai Pavan <saipavann@ami.com>
</commit_message>
<xml_diff>
--- a/MegaRAC Community Edition™ - Getting Started Guide - 3.1.docx
+++ b/MegaRAC Community Edition™ - Getting Started Guide - 3.1.docx
@@ -5482,7 +5482,7 @@
         </w:rPr>
       </w:pPr>
       <w:r>
-        <w:t>meta-ami/github-gitlab-url.sh</w:t>
+        <w:t>git clone https://github.com/ocp-hm-openbmc-opf-ami/meta-altera.git</w:t>
       </w:r>
     </w:p>
     <w:p>
@@ -5498,23 +5498,7 @@
         </w:rPr>
       </w:pPr>
       <w:r>
-        <w:t>TEMPLATECONF=meta-altera/meta-agilex3/conf/templates/</w:t>
-      </w:r>
-      <w:proofErr w:type="gramStart"/>
-      <w:r>
-        <w:t>default .</w:t>
-      </w:r>
-      <w:proofErr w:type="gramEnd"/>
-      <w:r>
-        <w:t xml:space="preserve"> </w:t>
-      </w:r>
-      <w:proofErr w:type="spellStart"/>
-      <w:r>
-        <w:t>openbmc</w:t>
-      </w:r>
-      <w:proofErr w:type="spellEnd"/>
-      <w:r>
-        <w:t>-env</w:t>
+        <w:t>meta-ami/github-gitlab-url.sh</w:t>
       </w:r>
     </w:p>
     <w:p>
@@ -5529,36 +5513,25 @@
           <w:rFonts w:cstheme="minorBidi"/>
         </w:rPr>
       </w:pPr>
+      <w:r>
+        <w:t>TEMPLATECONF=meta-altera/meta-agilex3/conf/templates/</w:t>
+      </w:r>
+      <w:proofErr w:type="gramStart"/>
+      <w:r>
+        <w:t>default .</w:t>
+      </w:r>
+      <w:proofErr w:type="gramEnd"/>
+      <w:r>
+        <w:t xml:space="preserve"> </w:t>
+      </w:r>
       <w:proofErr w:type="spellStart"/>
       <w:r>
-        <w:t>bitbake</w:t>
+        <w:t>openbmc</w:t>
       </w:r>
       <w:proofErr w:type="spellEnd"/>
       <w:r>
-        <w:t xml:space="preserve"> </w:t>
-      </w:r>
-      <w:proofErr w:type="spellStart"/>
-      <w:r>
-        <w:t>obmc</w:t>
-      </w:r>
-      <w:proofErr w:type="spellEnd"/>
-      <w:r>
-        <w:t>-phosphor-image</w:t>
-      </w:r>
-    </w:p>
-    <w:p>
-      <w:pPr>
-        <w:pStyle w:val="Heading2"/>
-        <w:rPr>
-          <w:rFonts w:cstheme="minorBidi"/>
-        </w:rPr>
-      </w:pPr>
-      <w:bookmarkStart w:id="16" w:name="_Toc211962933b"/>
-      <w:r>
-        <w:lastRenderedPageBreak/>
-        <w:t>Agilex-5</w:t>
-      </w:r>
-      <w:bookmarkEnd w:id="16"/>
+        <w:t>-env</w:t>
+      </w:r>
     </w:p>
     <w:p>
       <w:pPr>
@@ -5572,22 +5545,36 @@
           <w:rFonts w:cstheme="minorBidi"/>
         </w:rPr>
       </w:pPr>
-      <w:r>
-        <w:t xml:space="preserve">git clone --branch CE-AMI202607 https://github.com/ocp-hm-openbmc-opf-ami/openbmc </w:t>
-      </w:r>
       <w:proofErr w:type="spellStart"/>
       <w:r>
-        <w:t>openbmc</w:t>
+        <w:t>bitbake</w:t>
       </w:r>
       <w:proofErr w:type="spellEnd"/>
       <w:r>
-        <w:t xml:space="preserve">; cd </w:t>
+        <w:t xml:space="preserve"> </w:t>
       </w:r>
       <w:proofErr w:type="spellStart"/>
       <w:r>
-        <w:t>openbmc</w:t>
+        <w:t>obmc</w:t>
       </w:r>
       <w:proofErr w:type="spellEnd"/>
+      <w:r>
+        <w:t>-phosphor-image</w:t>
+      </w:r>
+    </w:p>
+    <w:p>
+      <w:pPr>
+        <w:pStyle w:val="Heading2"/>
+        <w:rPr>
+          <w:rFonts w:cstheme="minorBidi"/>
+        </w:rPr>
+      </w:pPr>
+      <w:bookmarkStart w:id="16" w:name="_Toc211962933b"/>
+      <w:r>
+        <w:lastRenderedPageBreak/>
+        <w:t>Agilex-5</w:t>
+      </w:r>
+      <w:bookmarkEnd w:id="16"/>
     </w:p>
     <w:p>
       <w:pPr>
@@ -5602,8 +5589,21 @@
         </w:rPr>
       </w:pPr>
       <w:r>
-        <w:t>git clone --branch CE-AMI202607 https://github.com/ocp-hm-openbmc-opf-ami/meta-core</w:t>
-      </w:r>
+        <w:t xml:space="preserve">git clone --branch CE-AMI202607 https://github.com/ocp-hm-openbmc-opf-ami/openbmc </w:t>
+      </w:r>
+      <w:proofErr w:type="spellStart"/>
+      <w:r>
+        <w:t>openbmc</w:t>
+      </w:r>
+      <w:proofErr w:type="spellEnd"/>
+      <w:r>
+        <w:t xml:space="preserve">; cd </w:t>
+      </w:r>
+      <w:proofErr w:type="spellStart"/>
+      <w:r>
+        <w:t>openbmc</w:t>
+      </w:r>
+      <w:proofErr w:type="spellEnd"/>
     </w:p>
     <w:p>
       <w:pPr>
@@ -5618,7 +5618,39 @@
         </w:rPr>
       </w:pPr>
       <w:r>
+        <w:t>git clone --branch CE-AMI202607 https://github.com/ocp-hm-openbmc-opf-ami/meta-core</w:t>
+      </w:r>
+    </w:p>
+    <w:p>
+      <w:pPr>
+        <w:pStyle w:val="ListNumber3"/>
+        <w:numPr>
+          <w:ilvl w:val="0"/>
+          <w:numId w:val="34"/>
+        </w:numPr>
+        <w:jc w:val="left"/>
+        <w:rPr>
+          <w:rFonts w:cstheme="minorBidi"/>
+        </w:rPr>
+      </w:pPr>
+      <w:r>
         <w:t>git clone --branch CE-AMI202607 https://github.com/ocp-hm-openbmc-opf-ami/meta-ami</w:t>
+      </w:r>
+    </w:p>
+    <w:p>
+      <w:pPr>
+        <w:pStyle w:val="ListNumber3"/>
+        <w:numPr>
+          <w:ilvl w:val="0"/>
+          <w:numId w:val="34"/>
+        </w:numPr>
+        <w:jc w:val="left"/>
+        <w:rPr>
+          <w:rFonts w:cstheme="minorBidi"/>
+        </w:rPr>
+      </w:pPr>
+      <w:r>
+        <w:t>git clone https://github.com/ocp-hm-openbmc-opf-ami/meta-altera.git</w:t>
       </w:r>
     </w:p>
     <w:p>

</xml_diff>